<commit_message>
fix(cfo): passe declara disciplinas/carga horaria perdidas + limite 25%
- passe.docx: novos campos "DISCIPLINA(S)/AULA(S) QUE SERAO PERDIDAS"
  e "CARGA HORARIA A PERDER" (em tempos de aula) + alerta do limite
  maximo de 25% de ausencia por disciplina (reprova por frequencia).
- Instrucoes "Como usar" da pagina /documentos atualizadas.

Co-Authored-By: Claude Fable 5 <noreply@anthropic.com>
</commit_message>
<xml_diff>
--- a/public/modelos/passe.docx
+++ b/public/modelos/passe.docx
@@ -123,6 +123,36 @@
     <w:p>
       <w:pPr>
         <w:jc w:val="left"/>
+        <w:spacing w:after="80" w:before="0" w:line="240" w:lineRule="auto"/>
+      </w:pPr>
+      <w:r>
+        <w:rPr>
+          <w:rFonts w:ascii="Arial" w:hAnsi="Arial"/>
+          <w:b/>
+          <w:color w:val="000000"/>
+          <w:sz w:val="22"/>
+        </w:rPr>
+        <w:t xml:space="preserve">HORARIO PREVISTO DE RETORNO: [__h__] do dia [DATA].</w:t>
+      </w:r>
+    </w:p>
+    <w:p>
+      <w:pPr>
+        <w:jc w:val="left"/>
+        <w:spacing w:after="80" w:before="0" w:line="240" w:lineRule="auto"/>
+      </w:pPr>
+      <w:r>
+        <w:rPr>
+          <w:rFonts w:ascii="Arial" w:hAnsi="Arial"/>
+          <w:b/>
+          <w:color w:val="000000"/>
+          <w:sz w:val="22"/>
+        </w:rPr>
+        <w:t xml:space="preserve">DISCIPLINA(S)/AULA(S) QUE SERAO PERDIDAS: [DISCIPLINA(S)]</w:t>
+      </w:r>
+    </w:p>
+    <w:p>
+      <w:pPr>
+        <w:jc w:val="left"/>
         <w:spacing w:after="240" w:before="0" w:line="240" w:lineRule="auto"/>
       </w:pPr>
       <w:r>
@@ -132,7 +162,23 @@
           <w:color w:val="000000"/>
           <w:sz w:val="22"/>
         </w:rPr>
-        <w:t xml:space="preserve">HORARIO PREVISTO DE RETORNO: [__h__] do dia [DATA].</w:t>
+        <w:t xml:space="preserve">CARGA HORARIA A PERDER: [__] tempo(s) de aula ([__h__min])</w:t>
+      </w:r>
+    </w:p>
+    <w:p>
+      <w:pPr>
+        <w:jc w:val="both"/>
+        <w:spacing w:after="240" w:before="0" w:line="240" w:lineRule="auto"/>
+      </w:pPr>
+      <w:r>
+        <w:rPr>
+          <w:rFonts w:ascii="Arial" w:hAnsi="Arial"/>
+          <w:b/>
+          <w:i/>
+          <w:color w:val="000000"/>
+          <w:sz w:val="20"/>
+        </w:rPr>
+        <w:t xml:space="preserve">OBS.: O limite maximo de ausencia por disciplina e de 25% da carga horaria total; ultrapassado esse limite, o aluno reprova por frequencia. Verifique o quanto ja faltou na disciplina antes de solicitar o passe.</w:t>
       </w:r>
     </w:p>
     <w:p>

</xml_diff>